<commit_message>
Correct team member names: Berthiaume, Neustadter, Demond Balentine
</commit_message>
<xml_diff>
--- a/docs/Team-Charter.docx
+++ b/docs/Team-Charter.docx
@@ -59,31 +59,31 @@
         </w:numPr>
       </w:pPr>
       <w:r>
-        <w:t xml:space="preserve">Michelle Borkiano</w:t>
-      </w:r>
-    </w:p>
-    <w:p>
-      <w:pPr>
-        <w:pStyle w:val="ListParagraph"/>
-        <w:numPr>
-          <w:ilvl w:val="0"/>
-          <w:numId w:val="1"/>
-        </w:numPr>
-      </w:pPr>
-      <w:r>
-        <w:t xml:space="preserve">Desmond Balentine</w:t>
-      </w:r>
-    </w:p>
-    <w:p>
-      <w:pPr>
-        <w:pStyle w:val="ListParagraph"/>
-        <w:numPr>
-          <w:ilvl w:val="0"/>
-          <w:numId w:val="1"/>
-        </w:numPr>
-      </w:pPr>
-      <w:r>
-        <w:t xml:space="preserve">Remington Mustadter</w:t>
+        <w:t xml:space="preserve">Michelle Berthiaume</w:t>
+      </w:r>
+    </w:p>
+    <w:p>
+      <w:pPr>
+        <w:pStyle w:val="ListParagraph"/>
+        <w:numPr>
+          <w:ilvl w:val="0"/>
+          <w:numId w:val="1"/>
+        </w:numPr>
+      </w:pPr>
+      <w:r>
+        <w:t xml:space="preserve">Demond Balentine</w:t>
+      </w:r>
+    </w:p>
+    <w:p>
+      <w:pPr>
+        <w:pStyle w:val="ListParagraph"/>
+        <w:numPr>
+          <w:ilvl w:val="0"/>
+          <w:numId w:val="1"/>
+        </w:numPr>
+      </w:pPr>
+      <w:r>
+        <w:t xml:space="preserve">Remington Neustadter</w:t>
       </w:r>
     </w:p>
     <w:p/>
@@ -135,7 +135,7 @@
         </w:numPr>
       </w:pPr>
       <w:r>
-        <w:t xml:space="preserve">Desmond: Backend development, architecture, leadership</w:t>
+        <w:t xml:space="preserve">Demond: Backend development, architecture, leadership</w:t>
       </w:r>
     </w:p>
     <w:p>
@@ -181,7 +181,7 @@
         </w:numPr>
       </w:pPr>
       <w:r>
-        <w:t xml:space="preserve">Desmond: Project lead and product direction; assigns project targets and tracks milestones.</w:t>
+        <w:t xml:space="preserve">Demond: Project lead and product direction; assigns project targets and tracks milestones.</w:t>
       </w:r>
     </w:p>
     <w:p>
@@ -327,7 +327,7 @@
                 <w:b w:val="false"/>
                 <w:bCs w:val="false"/>
               </w:rPr>
-              <w:t xml:space="preserve">Michelle Borkiano</w:t>
+              <w:t xml:space="preserve">Michelle Berthiaume</w:t>
             </w:r>
           </w:p>
         </w:tc>
@@ -399,7 +399,7 @@
                 <w:b w:val="false"/>
                 <w:bCs w:val="false"/>
               </w:rPr>
-              <w:t xml:space="preserve">Desmond Balentine</w:t>
+              <w:t xml:space="preserve">Demond Balentine</w:t>
             </w:r>
           </w:p>
         </w:tc>
@@ -471,7 +471,7 @@
                 <w:b w:val="false"/>
                 <w:bCs w:val="false"/>
               </w:rPr>
-              <w:t xml:space="preserve">Remington Mustadter</w:t>
+              <w:t xml:space="preserve">Remington Neustadter</w:t>
             </w:r>
           </w:p>
         </w:tc>
@@ -683,7 +683,7 @@
         </w:numPr>
       </w:pPr>
       <w:r>
-        <w:t xml:space="preserve">Final project-level calls made by Desmond after team suggestions</w:t>
+        <w:t xml:space="preserve">Final project-level calls made by Demond after team suggestions</w:t>
       </w:r>
     </w:p>
     <w:p>
@@ -978,7 +978,7 @@
         <w:t xml:space="preserve">Member 1 Printed Name: </w:t>
       </w:r>
       <w:r>
-        <w:t xml:space="preserve">Michelle Borkiano</w:t>
+        <w:t xml:space="preserve">Michelle Berthiaume</w:t>
       </w:r>
     </w:p>
     <w:p>
@@ -1015,7 +1015,7 @@
         <w:t xml:space="preserve">Member 2 Printed Name: </w:t>
       </w:r>
       <w:r>
-        <w:t xml:space="preserve">Remington Mustadter</w:t>
+        <w:t xml:space="preserve">Remington Neustadter</w:t>
       </w:r>
     </w:p>
     <w:p>
@@ -1052,7 +1052,7 @@
         <w:t xml:space="preserve">Member 3 Printed Name: </w:t>
       </w:r>
       <w:r>
-        <w:t xml:space="preserve">Desmond Balentine</w:t>
+        <w:t xml:space="preserve">Demond Balentine</w:t>
       </w:r>
     </w:p>
     <w:p>

</xml_diff>